<commit_message>
dynamic doc editor wip
</commit_message>
<xml_diff>
--- a/public/docs/BAC Resolution Declaring LCRB.docx
+++ b/public/docs/BAC Resolution Declaring LCRB.docx
@@ -299,7 +299,7 @@
           <w:sz w:val="24"/>
           <w:szCs w:val="24"/>
         </w:rPr>
-        <w:t>RESOLUTION NO. – PB-CW-0000-00-000</w:t>
+        <w:t>RESOLUTION NO. – PB-CW-{{resolution_number}}</w:t>
       </w:r>
     </w:p>
     <w:p>
@@ -398,7 +398,7 @@
           <w:sz w:val="24"/>
           <w:szCs w:val="24"/>
         </w:rPr>
-        <w:t>DATE</w:t>
+        <w:t>{{philGEPS_posting_date}}</w:t>
       </w:r>
       <w:r>
         <w:rPr>
@@ -413,7 +413,7 @@
           <w:sz w:val="24"/>
           <w:szCs w:val="24"/>
         </w:rPr>
-        <w:t>DATE– DATE</w:t>
+        <w:t>{{conspicuous_place_posting_date}}</w:t>
       </w:r>
       <w:r>
         <w:rPr>
@@ -501,21 +501,7 @@
           <w:sz w:val="24"/>
           <w:szCs w:val="24"/>
         </w:rPr>
-        <w:t xml:space="preserve">WHEREAS, in response to the said advertisements and publication, there were {{total_interested_bidders_lower}} interested bidders who submitted letter of intent and </w:t>
-      </w:r>
-      <w:r>
-        <w:rPr>
-          <w:sz w:val="24"/>
-          <w:szCs w:val="24"/>
-        </w:rPr>
-        <w:t>{{number_of_responsive_bidders}}</w:t>
-      </w:r>
-      <w:r>
-        <w:rPr>
-          <w:sz w:val="24"/>
-          <w:szCs w:val="24"/>
-        </w:rPr>
-        <w:t xml:space="preserve"> of these bidders purchased bidding documents and</w:t>
+        <w:t>WHEREAS, in response to the said advertisements and publication, there were {{total_interested_bidders_lower}} interested bidders who submitted letter of intent and {{number_of_responsive_bidders}} of these bidders purchased bidding documents and</w:t>
       </w:r>
       <w:r>
         <w:rPr>
@@ -629,16 +615,14 @@
         </w:rPr>
         <w:t xml:space="preserve">Whereas, upon evaluation of financial documents it appeared that the bid proposal of </w:t>
       </w:r>
-      <w:bookmarkStart w:id="0" w:name="bmCompanyName2"/>
-      <w:r>
-        <w:rPr>
-          <w:b/>
-          <w:sz w:val="24"/>
-          <w:szCs w:val="24"/>
-        </w:rPr>
-        <w:t>AZLJ CONSTRUCTION</w:t>
-      </w:r>
-      <w:bookmarkEnd w:id="0"/>
+      <w:r>
+        <w:rPr>
+          <w:b/>
+          <w:sz w:val="24"/>
+          <w:szCs w:val="24"/>
+        </w:rPr>
+        <w:t>{{winning_bidder_upper}}</w:t>
+      </w:r>
       <w:r>
         <w:rPr>
           <w:sz w:val="24"/>
@@ -823,7 +807,7 @@
                 <w:szCs w:val="24"/>
               </w:rPr>
             </w:pPr>
-            <w:bookmarkStart w:id="1" w:name="bmCompanyName3"/>
+            <w:bookmarkStart w:id="0" w:name="bmCompanyName3"/>
             <w:r>
               <w:rPr>
                 <w:b/>
@@ -832,7 +816,7 @@
               </w:rPr>
               <w:t>AZLJ CONSTRUCTION</w:t>
             </w:r>
-            <w:bookmarkEnd w:id="1"/>
+            <w:bookmarkEnd w:id="0"/>
           </w:p>
         </w:tc>
         <w:tc>
@@ -855,7 +839,7 @@
                 <w:szCs w:val="22"/>
               </w:rPr>
             </w:pPr>
-            <w:bookmarkStart w:id="2" w:name="bmAmountFigures"/>
+            <w:bookmarkStart w:id="1" w:name="bmAmountFigures"/>
             <w:r>
               <w:rPr>
                 <w:sz w:val="24"/>
@@ -863,7 +847,7 @@
               </w:rPr>
               <w:t>amount</w:t>
             </w:r>
-            <w:bookmarkEnd w:id="2"/>
+            <w:bookmarkEnd w:id="1"/>
           </w:p>
         </w:tc>
         <w:tc>
@@ -892,8 +876,8 @@
                 <w:szCs w:val="24"/>
               </w:rPr>
             </w:r>
-            <w:bookmarkStart w:id="3" w:name="_Hlk532640973"/>
-            <w:bookmarkEnd w:id="3"/>
+            <w:bookmarkStart w:id="2" w:name="_Hlk532640973"/>
+            <w:bookmarkEnd w:id="2"/>
           </w:p>
         </w:tc>
       </w:tr>
@@ -1517,7 +1501,7 @@
                 <w:szCs w:val="24"/>
               </w:rPr>
             </w:pPr>
-            <w:bookmarkStart w:id="4" w:name="bmCompanyName4"/>
+            <w:bookmarkStart w:id="3" w:name="bmCompanyName4"/>
             <w:r>
               <w:rPr>
                 <w:b/>
@@ -1526,7 +1510,7 @@
               </w:rPr>
               <w:t>AZLJ CONSTRUCTION</w:t>
             </w:r>
-            <w:bookmarkEnd w:id="4"/>
+            <w:bookmarkEnd w:id="3"/>
           </w:p>
         </w:tc>
         <w:tc>
@@ -1550,14 +1534,14 @@
                 <w:szCs w:val="22"/>
               </w:rPr>
             </w:pPr>
-            <w:bookmarkStart w:id="5" w:name="bmAmountFigures2"/>
+            <w:bookmarkStart w:id="4" w:name="bmAmountFigures2"/>
             <w:r>
               <w:rPr>
                 <w:sz w:val="24"/>
               </w:rPr>
               <w:t>amount</w:t>
             </w:r>
-            <w:bookmarkEnd w:id="5"/>
+            <w:bookmarkEnd w:id="4"/>
           </w:p>
         </w:tc>
         <w:tc>
@@ -2077,16 +2061,16 @@
         </w:rPr>
         <w:t xml:space="preserve">WHEREAS, upon post-qualification or careful examination, validation and verification of all the eligibility, technical and financial requirements submitted by the Bidders with the Lowest Calculated Bid, </w:t>
       </w:r>
-      <w:bookmarkStart w:id="6" w:name="bmCompanyName5"/>
-      <w:r>
-        <w:rPr>
-          <w:b/>
-          <w:sz w:val="24"/>
-          <w:szCs w:val="24"/>
-        </w:rPr>
-        <w:t>AZLJ CONSTRUCTION</w:t>
-      </w:r>
-      <w:bookmarkEnd w:id="6"/>
+      <w:bookmarkStart w:id="5" w:name="bmCompanyName5"/>
+      <w:r>
+        <w:rPr>
+          <w:b/>
+          <w:sz w:val="24"/>
+          <w:szCs w:val="24"/>
+        </w:rPr>
+        <w:t>{{winning_bidder_upper}}</w:t>
+      </w:r>
+      <w:bookmarkEnd w:id="5"/>
       <w:r>
         <w:rPr>
           <w:sz w:val="24"/>
@@ -2182,16 +2166,16 @@
         </w:rPr>
         <w:t xml:space="preserve">To declare </w:t>
       </w:r>
-      <w:bookmarkStart w:id="7" w:name="bmCompanyName6"/>
-      <w:r>
-        <w:rPr>
-          <w:b/>
-          <w:sz w:val="24"/>
-          <w:szCs w:val="24"/>
-        </w:rPr>
-        <w:t>AZLJ CONSTRUCTION</w:t>
-      </w:r>
-      <w:bookmarkEnd w:id="7"/>
+      <w:bookmarkStart w:id="6" w:name="bmCompanyName6"/>
+      <w:r>
+        <w:rPr>
+          <w:b/>
+          <w:sz w:val="24"/>
+          <w:szCs w:val="24"/>
+        </w:rPr>
+        <w:t>{{winning_bidder_upper}}</w:t>
+      </w:r>
+      <w:bookmarkEnd w:id="6"/>
       <w:r>
         <w:rPr>
           <w:sz w:val="24"/>
@@ -2199,22 +2183,23 @@
         </w:rPr>
         <w:t xml:space="preserve"> as the Bidder with the Lowest Calculated Responsive Bid for the </w:t>
       </w:r>
-      <w:bookmarkStart w:id="8" w:name="bmProjectName2"/>
-      <w:r>
-        <w:rPr>
-          <w:b/>
-          <w:sz w:val="24"/>
-        </w:rPr>
-        <w:t>CONSTRUCTION OF A DECORATIVE FENCE AROUND POBLACION</w:t>
-      </w:r>
-      <w:bookmarkEnd w:id="8"/>
-      <w:r>
-        <w:rPr>
-          <w:b/>
-          <w:sz w:val="24"/>
+      <w:r>
+        <w:rPr>
+          <w:b/>
+          <w:bCs/>
+          <w:sz w:val="24"/>
+          <w:szCs w:val="24"/>
           <w:lang w:val="en-PH" w:eastAsia="en-PH"/>
         </w:rPr>
-        <w:t>, CASIGURAN SORSOGON,</w:t>
+        <w:t>{{project_title_upper}}</w:t>
+      </w:r>
+      <w:r>
+        <w:rPr>
+          <w:b/>
+          <w:sz w:val="24"/>
+          <w:lang w:val="en-PH" w:eastAsia="en-PH"/>
+        </w:rPr>
+        <w:t>,</w:t>
       </w:r>
     </w:p>
     <w:p>

</xml_diff>

<commit_message>
success table 1 editable table
</commit_message>
<xml_diff>
--- a/public/docs/BAC Resolution Declaring LCRB.docx
+++ b/public/docs/BAC Resolution Declaring LCRB.docx
@@ -661,15 +661,15 @@
         <w:tblLook w:noHBand="0" w:noVBand="0" w:firstColumn="0" w:lastRow="0" w:lastColumn="0" w:firstRow="0" w:val="0000"/>
       </w:tblPr>
       <w:tblGrid>
-        <w:gridCol w:w="5055"/>
-        <w:gridCol w:w="2159"/>
+        <w:gridCol w:w="5145"/>
+        <w:gridCol w:w="2069"/>
         <w:gridCol w:w="1642"/>
       </w:tblGrid>
       <w:tr>
         <w:trPr/>
         <w:tc>
           <w:tcPr>
-            <w:tcW w:w="5055" w:type="dxa"/>
+            <w:tcW w:w="5145" w:type="dxa"/>
             <w:tcBorders>
               <w:top w:val="single" w:sz="4" w:space="0" w:color="000000"/>
               <w:left w:val="single" w:sz="4" w:space="0" w:color="000000"/>
@@ -699,7 +699,7 @@
         </w:tc>
         <w:tc>
           <w:tcPr>
-            <w:tcW w:w="2159" w:type="dxa"/>
+            <w:tcW w:w="2069" w:type="dxa"/>
             <w:tcBorders>
               <w:top w:val="single" w:sz="4" w:space="0" w:color="000000"/>
               <w:left w:val="single" w:sz="4" w:space="0" w:color="000000"/>
@@ -783,7 +783,7 @@
         <w:trPr/>
         <w:tc>
           <w:tcPr>
-            <w:tcW w:w="5055" w:type="dxa"/>
+            <w:tcW w:w="5145" w:type="dxa"/>
             <w:tcBorders>
               <w:top w:val="single" w:sz="4" w:space="0" w:color="000000"/>
               <w:left w:val="single" w:sz="4" w:space="0" w:color="000000"/>
@@ -814,14 +814,22 @@
                 <w:sz w:val="24"/>
                 <w:szCs w:val="24"/>
               </w:rPr>
-              <w:t>AZLJ CONSTRUCTION</w:t>
+              <w:t>{</w:t>
             </w:r>
             <w:bookmarkEnd w:id="0"/>
+            <w:r>
+              <w:rPr>
+                <w:b/>
+                <w:sz w:val="24"/>
+                <w:szCs w:val="24"/>
+              </w:rPr>
+              <w:t>{row_bidder_upper}}</w:t>
+            </w:r>
           </w:p>
         </w:tc>
         <w:tc>
           <w:tcPr>
-            <w:tcW w:w="2159" w:type="dxa"/>
+            <w:tcW w:w="2069" w:type="dxa"/>
             <w:tcBorders>
               <w:top w:val="single" w:sz="4" w:space="0" w:color="000000"/>
               <w:left w:val="single" w:sz="4" w:space="0" w:color="000000"/>
@@ -845,99 +853,15 @@
                 <w:sz w:val="24"/>
                 <w:szCs w:val="22"/>
               </w:rPr>
-              <w:t>amount</w:t>
+              <w:t>{</w:t>
             </w:r>
             <w:bookmarkEnd w:id="1"/>
-          </w:p>
-        </w:tc>
-        <w:tc>
-          <w:tcPr>
-            <w:tcW w:w="1642" w:type="dxa"/>
-            <w:tcBorders>
-              <w:top w:val="single" w:sz="4" w:space="0" w:color="000000"/>
-              <w:left w:val="single" w:sz="4" w:space="0" w:color="000000"/>
-              <w:bottom w:val="single" w:sz="4" w:space="0" w:color="000000"/>
-              <w:right w:val="single" w:sz="4" w:space="0" w:color="000000"/>
-            </w:tcBorders>
-            <w:vAlign w:val="center"/>
-          </w:tcPr>
-          <w:p>
-            <w:pPr>
-              <w:pStyle w:val="Normal"/>
-              <w:jc w:val="center"/>
-              <w:rPr>
-                <w:sz w:val="24"/>
-                <w:szCs w:val="24"/>
-              </w:rPr>
-            </w:pPr>
-            <w:r>
-              <w:rPr>
-                <w:sz w:val="24"/>
-                <w:szCs w:val="24"/>
-              </w:rPr>
-            </w:r>
-            <w:bookmarkStart w:id="2" w:name="_Hlk532640973"/>
-            <w:bookmarkEnd w:id="2"/>
-          </w:p>
-        </w:tc>
-      </w:tr>
-      <w:tr>
-        <w:trPr/>
-        <w:tc>
-          <w:tcPr>
-            <w:tcW w:w="5055" w:type="dxa"/>
-            <w:tcBorders>
-              <w:top w:val="single" w:sz="4" w:space="0" w:color="000000"/>
-              <w:left w:val="single" w:sz="4" w:space="0" w:color="000000"/>
-              <w:bottom w:val="single" w:sz="4" w:space="0" w:color="000000"/>
-              <w:right w:val="single" w:sz="4" w:space="0" w:color="000000"/>
-            </w:tcBorders>
-            <w:vAlign w:val="center"/>
-          </w:tcPr>
-          <w:p>
-            <w:pPr>
-              <w:pStyle w:val="Normal"/>
-              <w:jc w:val="both"/>
-              <w:rPr>
-                <w:b/>
-                <w:sz w:val="24"/>
-                <w:szCs w:val="24"/>
-              </w:rPr>
-            </w:pPr>
-            <w:r>
-              <w:rPr>
-                <w:b/>
-                <w:sz w:val="24"/>
-                <w:szCs w:val="24"/>
-              </w:rPr>
-            </w:r>
-          </w:p>
-        </w:tc>
-        <w:tc>
-          <w:tcPr>
-            <w:tcW w:w="2159" w:type="dxa"/>
-            <w:tcBorders>
-              <w:top w:val="single" w:sz="4" w:space="0" w:color="000000"/>
-              <w:left w:val="single" w:sz="4" w:space="0" w:color="000000"/>
-              <w:bottom w:val="single" w:sz="4" w:space="0" w:color="000000"/>
-              <w:right w:val="single" w:sz="4" w:space="0" w:color="000000"/>
-            </w:tcBorders>
-            <w:vAlign w:val="center"/>
-          </w:tcPr>
-          <w:p>
-            <w:pPr>
-              <w:pStyle w:val="Normal"/>
-              <w:jc w:val="center"/>
-              <w:rPr>
-                <w:sz w:val="24"/>
-                <w:szCs w:val="22"/>
-              </w:rPr>
-            </w:pPr>
             <w:r>
               <w:rPr>
                 <w:sz w:val="24"/>
                 <w:szCs w:val="22"/>
               </w:rPr>
+              <w:t>{row_amount_read}}</w:t>
             </w:r>
           </w:p>
         </w:tc>
@@ -961,351 +885,14 @@
                 <w:szCs w:val="24"/>
               </w:rPr>
             </w:pPr>
+            <w:bookmarkStart w:id="2" w:name="_Hlk532640973"/>
+            <w:bookmarkEnd w:id="2"/>
             <w:r>
               <w:rPr>
                 <w:sz w:val="24"/>
                 <w:szCs w:val="24"/>
               </w:rPr>
-            </w:r>
-          </w:p>
-        </w:tc>
-      </w:tr>
-      <w:tr>
-        <w:trPr/>
-        <w:tc>
-          <w:tcPr>
-            <w:tcW w:w="5055" w:type="dxa"/>
-            <w:tcBorders>
-              <w:top w:val="single" w:sz="4" w:space="0" w:color="000000"/>
-              <w:left w:val="single" w:sz="4" w:space="0" w:color="000000"/>
-              <w:bottom w:val="single" w:sz="4" w:space="0" w:color="000000"/>
-              <w:right w:val="single" w:sz="4" w:space="0" w:color="000000"/>
-            </w:tcBorders>
-            <w:vAlign w:val="center"/>
-          </w:tcPr>
-          <w:p>
-            <w:pPr>
-              <w:pStyle w:val="Normal"/>
-              <w:jc w:val="both"/>
-              <w:rPr>
-                <w:b/>
-                <w:sz w:val="24"/>
-                <w:szCs w:val="24"/>
-              </w:rPr>
-            </w:pPr>
-            <w:r>
-              <w:rPr>
-                <w:b/>
-                <w:sz w:val="24"/>
-                <w:szCs w:val="24"/>
-              </w:rPr>
-            </w:r>
-          </w:p>
-        </w:tc>
-        <w:tc>
-          <w:tcPr>
-            <w:tcW w:w="2159" w:type="dxa"/>
-            <w:tcBorders>
-              <w:top w:val="single" w:sz="4" w:space="0" w:color="000000"/>
-              <w:left w:val="single" w:sz="4" w:space="0" w:color="000000"/>
-              <w:bottom w:val="single" w:sz="4" w:space="0" w:color="000000"/>
-              <w:right w:val="single" w:sz="4" w:space="0" w:color="000000"/>
-            </w:tcBorders>
-            <w:vAlign w:val="center"/>
-          </w:tcPr>
-          <w:p>
-            <w:pPr>
-              <w:pStyle w:val="Normal"/>
-              <w:jc w:val="center"/>
-              <w:rPr>
-                <w:sz w:val="24"/>
-              </w:rPr>
-            </w:pPr>
-            <w:r>
-              <w:rPr>
-                <w:sz w:val="24"/>
-              </w:rPr>
-            </w:r>
-          </w:p>
-        </w:tc>
-        <w:tc>
-          <w:tcPr>
-            <w:tcW w:w="1642" w:type="dxa"/>
-            <w:tcBorders>
-              <w:top w:val="single" w:sz="4" w:space="0" w:color="000000"/>
-              <w:left w:val="single" w:sz="4" w:space="0" w:color="000000"/>
-              <w:bottom w:val="single" w:sz="4" w:space="0" w:color="000000"/>
-              <w:right w:val="single" w:sz="4" w:space="0" w:color="000000"/>
-            </w:tcBorders>
-            <w:vAlign w:val="center"/>
-          </w:tcPr>
-          <w:p>
-            <w:pPr>
-              <w:pStyle w:val="Normal"/>
-              <w:jc w:val="center"/>
-              <w:rPr>
-                <w:sz w:val="24"/>
-              </w:rPr>
-            </w:pPr>
-            <w:r>
-              <w:rPr>
-                <w:sz w:val="24"/>
-              </w:rPr>
-            </w:r>
-          </w:p>
-        </w:tc>
-      </w:tr>
-      <w:tr>
-        <w:trPr/>
-        <w:tc>
-          <w:tcPr>
-            <w:tcW w:w="5055" w:type="dxa"/>
-            <w:tcBorders>
-              <w:top w:val="single" w:sz="4" w:space="0" w:color="000000"/>
-              <w:left w:val="single" w:sz="4" w:space="0" w:color="000000"/>
-              <w:bottom w:val="single" w:sz="4" w:space="0" w:color="000000"/>
-              <w:right w:val="single" w:sz="4" w:space="0" w:color="000000"/>
-            </w:tcBorders>
-            <w:vAlign w:val="center"/>
-          </w:tcPr>
-          <w:p>
-            <w:pPr>
-              <w:pStyle w:val="Normal"/>
-              <w:jc w:val="both"/>
-              <w:rPr>
-                <w:b/>
-                <w:sz w:val="24"/>
-                <w:szCs w:val="24"/>
-              </w:rPr>
-            </w:pPr>
-            <w:r>
-              <w:rPr>
-                <w:b/>
-                <w:sz w:val="24"/>
-                <w:szCs w:val="24"/>
-              </w:rPr>
-            </w:r>
-          </w:p>
-        </w:tc>
-        <w:tc>
-          <w:tcPr>
-            <w:tcW w:w="2159" w:type="dxa"/>
-            <w:tcBorders>
-              <w:top w:val="single" w:sz="4" w:space="0" w:color="000000"/>
-              <w:left w:val="single" w:sz="4" w:space="0" w:color="000000"/>
-              <w:bottom w:val="single" w:sz="4" w:space="0" w:color="000000"/>
-              <w:right w:val="single" w:sz="4" w:space="0" w:color="000000"/>
-            </w:tcBorders>
-            <w:vAlign w:val="center"/>
-          </w:tcPr>
-          <w:p>
-            <w:pPr>
-              <w:pStyle w:val="Normal"/>
-              <w:jc w:val="center"/>
-              <w:rPr>
-                <w:sz w:val="24"/>
-              </w:rPr>
-            </w:pPr>
-            <w:r>
-              <w:rPr>
-                <w:sz w:val="24"/>
-              </w:rPr>
-            </w:r>
-          </w:p>
-        </w:tc>
-        <w:tc>
-          <w:tcPr>
-            <w:tcW w:w="1642" w:type="dxa"/>
-            <w:tcBorders>
-              <w:top w:val="single" w:sz="4" w:space="0" w:color="000000"/>
-              <w:left w:val="single" w:sz="4" w:space="0" w:color="000000"/>
-              <w:bottom w:val="single" w:sz="4" w:space="0" w:color="000000"/>
-              <w:right w:val="single" w:sz="4" w:space="0" w:color="000000"/>
-            </w:tcBorders>
-            <w:vAlign w:val="center"/>
-          </w:tcPr>
-          <w:p>
-            <w:pPr>
-              <w:pStyle w:val="Normal"/>
-              <w:jc w:val="center"/>
-              <w:rPr>
-                <w:sz w:val="24"/>
-              </w:rPr>
-            </w:pPr>
-            <w:r>
-              <w:rPr>
-                <w:sz w:val="24"/>
-              </w:rPr>
-            </w:r>
-          </w:p>
-        </w:tc>
-      </w:tr>
-      <w:tr>
-        <w:trPr/>
-        <w:tc>
-          <w:tcPr>
-            <w:tcW w:w="5055" w:type="dxa"/>
-            <w:tcBorders>
-              <w:top w:val="single" w:sz="4" w:space="0" w:color="000000"/>
-              <w:left w:val="single" w:sz="4" w:space="0" w:color="000000"/>
-              <w:bottom w:val="single" w:sz="4" w:space="0" w:color="000000"/>
-              <w:right w:val="single" w:sz="4" w:space="0" w:color="000000"/>
-            </w:tcBorders>
-            <w:vAlign w:val="center"/>
-          </w:tcPr>
-          <w:p>
-            <w:pPr>
-              <w:pStyle w:val="Normal"/>
-              <w:jc w:val="both"/>
-              <w:rPr>
-                <w:b/>
-                <w:sz w:val="24"/>
-                <w:szCs w:val="24"/>
-              </w:rPr>
-            </w:pPr>
-            <w:r>
-              <w:rPr>
-                <w:b/>
-                <w:sz w:val="24"/>
-                <w:szCs w:val="24"/>
-              </w:rPr>
-            </w:r>
-          </w:p>
-        </w:tc>
-        <w:tc>
-          <w:tcPr>
-            <w:tcW w:w="2159" w:type="dxa"/>
-            <w:tcBorders>
-              <w:top w:val="single" w:sz="4" w:space="0" w:color="000000"/>
-              <w:left w:val="single" w:sz="4" w:space="0" w:color="000000"/>
-              <w:bottom w:val="single" w:sz="4" w:space="0" w:color="000000"/>
-              <w:right w:val="single" w:sz="4" w:space="0" w:color="000000"/>
-            </w:tcBorders>
-            <w:vAlign w:val="center"/>
-          </w:tcPr>
-          <w:p>
-            <w:pPr>
-              <w:pStyle w:val="Normal"/>
-              <w:jc w:val="center"/>
-              <w:rPr>
-                <w:sz w:val="24"/>
-              </w:rPr>
-            </w:pPr>
-            <w:r>
-              <w:rPr>
-                <w:sz w:val="24"/>
-              </w:rPr>
-            </w:r>
-          </w:p>
-        </w:tc>
-        <w:tc>
-          <w:tcPr>
-            <w:tcW w:w="1642" w:type="dxa"/>
-            <w:tcBorders>
-              <w:top w:val="single" w:sz="4" w:space="0" w:color="000000"/>
-              <w:left w:val="single" w:sz="4" w:space="0" w:color="000000"/>
-              <w:bottom w:val="single" w:sz="4" w:space="0" w:color="000000"/>
-              <w:right w:val="single" w:sz="4" w:space="0" w:color="000000"/>
-            </w:tcBorders>
-            <w:vAlign w:val="center"/>
-          </w:tcPr>
-          <w:p>
-            <w:pPr>
-              <w:pStyle w:val="Normal"/>
-              <w:jc w:val="center"/>
-              <w:rPr>
-                <w:sz w:val="24"/>
-              </w:rPr>
-            </w:pPr>
-            <w:r>
-              <w:rPr>
-                <w:sz w:val="24"/>
-              </w:rPr>
-            </w:r>
-          </w:p>
-        </w:tc>
-      </w:tr>
-      <w:tr>
-        <w:trPr/>
-        <w:tc>
-          <w:tcPr>
-            <w:tcW w:w="5055" w:type="dxa"/>
-            <w:tcBorders>
-              <w:top w:val="single" w:sz="4" w:space="0" w:color="000000"/>
-              <w:left w:val="single" w:sz="4" w:space="0" w:color="000000"/>
-              <w:bottom w:val="single" w:sz="4" w:space="0" w:color="000000"/>
-              <w:right w:val="single" w:sz="4" w:space="0" w:color="000000"/>
-            </w:tcBorders>
-            <w:vAlign w:val="center"/>
-          </w:tcPr>
-          <w:p>
-            <w:pPr>
-              <w:pStyle w:val="Normal"/>
-              <w:jc w:val="both"/>
-              <w:rPr>
-                <w:b/>
-                <w:sz w:val="24"/>
-                <w:szCs w:val="24"/>
-              </w:rPr>
-            </w:pPr>
-            <w:r>
-              <w:rPr>
-                <w:b/>
-                <w:sz w:val="24"/>
-                <w:szCs w:val="24"/>
-              </w:rPr>
-            </w:r>
-          </w:p>
-        </w:tc>
-        <w:tc>
-          <w:tcPr>
-            <w:tcW w:w="2159" w:type="dxa"/>
-            <w:tcBorders>
-              <w:top w:val="single" w:sz="4" w:space="0" w:color="000000"/>
-              <w:left w:val="single" w:sz="4" w:space="0" w:color="000000"/>
-              <w:bottom w:val="single" w:sz="4" w:space="0" w:color="000000"/>
-              <w:right w:val="single" w:sz="4" w:space="0" w:color="000000"/>
-            </w:tcBorders>
-            <w:vAlign w:val="center"/>
-          </w:tcPr>
-          <w:p>
-            <w:pPr>
-              <w:pStyle w:val="Normal"/>
-              <w:jc w:val="center"/>
-              <w:rPr>
-                <w:sz w:val="24"/>
-              </w:rPr>
-            </w:pPr>
-            <w:r>
-              <w:rPr>
-                <w:sz w:val="24"/>
-              </w:rPr>
-            </w:r>
-          </w:p>
-        </w:tc>
-        <w:tc>
-          <w:tcPr>
-            <w:tcW w:w="1642" w:type="dxa"/>
-            <w:tcBorders>
-              <w:top w:val="single" w:sz="4" w:space="0" w:color="000000"/>
-              <w:left w:val="single" w:sz="4" w:space="0" w:color="000000"/>
-              <w:bottom w:val="single" w:sz="4" w:space="0" w:color="000000"/>
-              <w:right w:val="single" w:sz="4" w:space="0" w:color="000000"/>
-            </w:tcBorders>
-            <w:vAlign w:val="center"/>
-          </w:tcPr>
-          <w:p>
-            <w:pPr>
-              <w:pStyle w:val="Normal"/>
-              <w:jc w:val="center"/>
-              <w:rPr>
-                <w:sz w:val="24"/>
-              </w:rPr>
-            </w:pPr>
-            <w:r>
-              <w:rPr>
-                <w:sz w:val="24"/>
-              </w:rPr>
+              <w:t>{{row_variance}}</w:t>
             </w:r>
           </w:p>
         </w:tc>
@@ -1374,15 +961,15 @@
         <w:tblLook w:noHBand="0" w:noVBand="0" w:firstColumn="0" w:lastRow="0" w:lastColumn="0" w:firstRow="0" w:val="0000"/>
       </w:tblPr>
       <w:tblGrid>
-        <w:gridCol w:w="5055"/>
-        <w:gridCol w:w="2159"/>
+        <w:gridCol w:w="4692"/>
+        <w:gridCol w:w="2522"/>
         <w:gridCol w:w="1642"/>
       </w:tblGrid>
       <w:tr>
         <w:trPr/>
         <w:tc>
           <w:tcPr>
-            <w:tcW w:w="5055" w:type="dxa"/>
+            <w:tcW w:w="4692" w:type="dxa"/>
             <w:tcBorders>
               <w:top w:val="single" w:sz="4" w:space="0" w:color="000000"/>
               <w:left w:val="single" w:sz="4" w:space="0" w:color="000000"/>
@@ -1412,7 +999,7 @@
         </w:tc>
         <w:tc>
           <w:tcPr>
-            <w:tcW w:w="2159" w:type="dxa"/>
+            <w:tcW w:w="2522" w:type="dxa"/>
             <w:tcBorders>
               <w:top w:val="single" w:sz="4" w:space="0" w:color="000000"/>
               <w:left w:val="single" w:sz="4" w:space="0" w:color="000000"/>
@@ -1477,7 +1064,7 @@
         <w:trPr/>
         <w:tc>
           <w:tcPr>
-            <w:tcW w:w="5055" w:type="dxa"/>
+            <w:tcW w:w="4692" w:type="dxa"/>
             <w:tcBorders>
               <w:top w:val="single" w:sz="4" w:space="0" w:color="000000"/>
               <w:left w:val="single" w:sz="4" w:space="0" w:color="000000"/>
@@ -1501,101 +1088,6 @@
                 <w:szCs w:val="24"/>
               </w:rPr>
             </w:pPr>
-            <w:bookmarkStart w:id="3" w:name="bmCompanyName4"/>
-            <w:r>
-              <w:rPr>
-                <w:b/>
-                <w:sz w:val="24"/>
-                <w:szCs w:val="24"/>
-              </w:rPr>
-              <w:t>AZLJ CONSTRUCTION</w:t>
-            </w:r>
-            <w:bookmarkEnd w:id="3"/>
-          </w:p>
-        </w:tc>
-        <w:tc>
-          <w:tcPr>
-            <w:tcW w:w="2159" w:type="dxa"/>
-            <w:tcBorders>
-              <w:top w:val="single" w:sz="4" w:space="0" w:color="000000"/>
-              <w:left w:val="single" w:sz="4" w:space="0" w:color="000000"/>
-              <w:bottom w:val="single" w:sz="4" w:space="0" w:color="000000"/>
-              <w:right w:val="single" w:sz="4" w:space="0" w:color="000000"/>
-            </w:tcBorders>
-            <w:vAlign w:val="center"/>
-          </w:tcPr>
-          <w:p>
-            <w:pPr>
-              <w:pStyle w:val="Normal"/>
-              <w:jc w:val="center"/>
-              <w:rPr>
-                <w:rFonts w:ascii="Arial Narrow" w:hAnsi="Arial Narrow"/>
-                <w:sz w:val="22"/>
-                <w:szCs w:val="22"/>
-              </w:rPr>
-            </w:pPr>
-            <w:bookmarkStart w:id="4" w:name="bmAmountFigures2"/>
-            <w:r>
-              <w:rPr>
-                <w:sz w:val="24"/>
-              </w:rPr>
-              <w:t>amount</w:t>
-            </w:r>
-            <w:bookmarkEnd w:id="4"/>
-          </w:p>
-        </w:tc>
-        <w:tc>
-          <w:tcPr>
-            <w:tcW w:w="1642" w:type="dxa"/>
-            <w:tcBorders>
-              <w:top w:val="single" w:sz="4" w:space="0" w:color="000000"/>
-              <w:left w:val="single" w:sz="4" w:space="0" w:color="000000"/>
-              <w:bottom w:val="single" w:sz="4" w:space="0" w:color="000000"/>
-              <w:right w:val="single" w:sz="4" w:space="0" w:color="000000"/>
-            </w:tcBorders>
-            <w:vAlign w:val="center"/>
-          </w:tcPr>
-          <w:p>
-            <w:pPr>
-              <w:pStyle w:val="Normal"/>
-              <w:jc w:val="center"/>
-              <w:rPr>
-                <w:sz w:val="24"/>
-                <w:szCs w:val="24"/>
-              </w:rPr>
-            </w:pPr>
-            <w:r>
-              <w:rPr>
-                <w:sz w:val="24"/>
-                <w:szCs w:val="24"/>
-              </w:rPr>
-            </w:r>
-          </w:p>
-        </w:tc>
-      </w:tr>
-      <w:tr>
-        <w:trPr/>
-        <w:tc>
-          <w:tcPr>
-            <w:tcW w:w="5055" w:type="dxa"/>
-            <w:tcBorders>
-              <w:top w:val="single" w:sz="4" w:space="0" w:color="000000"/>
-              <w:left w:val="single" w:sz="4" w:space="0" w:color="000000"/>
-              <w:bottom w:val="single" w:sz="4" w:space="0" w:color="000000"/>
-              <w:right w:val="single" w:sz="4" w:space="0" w:color="000000"/>
-            </w:tcBorders>
-            <w:vAlign w:val="center"/>
-          </w:tcPr>
-          <w:p>
-            <w:pPr>
-              <w:pStyle w:val="Normal"/>
-              <w:jc w:val="both"/>
-              <w:rPr>
-                <w:rFonts w:ascii="Arial Narrow" w:hAnsi="Arial Narrow"/>
-                <w:sz w:val="24"/>
-                <w:szCs w:val="24"/>
-              </w:rPr>
-            </w:pPr>
             <w:r>
               <w:rPr>
                 <w:rFonts w:ascii="Arial Narrow" w:hAnsi="Arial Narrow"/>
@@ -1607,371 +1099,7 @@
         </w:tc>
         <w:tc>
           <w:tcPr>
-            <w:tcW w:w="2159" w:type="dxa"/>
-            <w:tcBorders>
-              <w:top w:val="single" w:sz="4" w:space="0" w:color="000000"/>
-              <w:left w:val="single" w:sz="4" w:space="0" w:color="000000"/>
-              <w:bottom w:val="single" w:sz="4" w:space="0" w:color="000000"/>
-              <w:right w:val="single" w:sz="4" w:space="0" w:color="000000"/>
-            </w:tcBorders>
-            <w:vAlign w:val="center"/>
-          </w:tcPr>
-          <w:p>
-            <w:pPr>
-              <w:pStyle w:val="Normal"/>
-              <w:jc w:val="center"/>
-              <w:rPr>
-                <w:rFonts w:ascii="Arial Narrow" w:hAnsi="Arial Narrow"/>
-                <w:sz w:val="22"/>
-                <w:szCs w:val="22"/>
-              </w:rPr>
-            </w:pPr>
-            <w:r>
-              <w:rPr>
-                <w:rFonts w:ascii="Arial Narrow" w:hAnsi="Arial Narrow"/>
-                <w:sz w:val="22"/>
-                <w:szCs w:val="22"/>
-              </w:rPr>
-            </w:r>
-          </w:p>
-        </w:tc>
-        <w:tc>
-          <w:tcPr>
-            <w:tcW w:w="1642" w:type="dxa"/>
-            <w:tcBorders>
-              <w:top w:val="single" w:sz="4" w:space="0" w:color="000000"/>
-              <w:left w:val="single" w:sz="4" w:space="0" w:color="000000"/>
-              <w:bottom w:val="single" w:sz="4" w:space="0" w:color="000000"/>
-              <w:right w:val="single" w:sz="4" w:space="0" w:color="000000"/>
-            </w:tcBorders>
-            <w:vAlign w:val="center"/>
-          </w:tcPr>
-          <w:p>
-            <w:pPr>
-              <w:pStyle w:val="Normal"/>
-              <w:jc w:val="center"/>
-              <w:rPr>
-                <w:sz w:val="24"/>
-                <w:szCs w:val="24"/>
-              </w:rPr>
-            </w:pPr>
-            <w:r>
-              <w:rPr>
-                <w:sz w:val="24"/>
-                <w:szCs w:val="24"/>
-              </w:rPr>
-            </w:r>
-          </w:p>
-        </w:tc>
-      </w:tr>
-      <w:tr>
-        <w:trPr/>
-        <w:tc>
-          <w:tcPr>
-            <w:tcW w:w="5055" w:type="dxa"/>
-            <w:tcBorders>
-              <w:top w:val="single" w:sz="4" w:space="0" w:color="000000"/>
-              <w:left w:val="single" w:sz="4" w:space="0" w:color="000000"/>
-              <w:bottom w:val="single" w:sz="4" w:space="0" w:color="000000"/>
-              <w:right w:val="single" w:sz="4" w:space="0" w:color="000000"/>
-            </w:tcBorders>
-            <w:vAlign w:val="center"/>
-          </w:tcPr>
-          <w:p>
-            <w:pPr>
-              <w:pStyle w:val="Normal"/>
-              <w:jc w:val="both"/>
-              <w:rPr>
-                <w:rFonts w:ascii="Arial Narrow" w:hAnsi="Arial Narrow"/>
-                <w:sz w:val="24"/>
-                <w:szCs w:val="24"/>
-              </w:rPr>
-            </w:pPr>
-            <w:r>
-              <w:rPr>
-                <w:rFonts w:ascii="Arial Narrow" w:hAnsi="Arial Narrow"/>
-                <w:sz w:val="24"/>
-                <w:szCs w:val="24"/>
-              </w:rPr>
-            </w:r>
-          </w:p>
-        </w:tc>
-        <w:tc>
-          <w:tcPr>
-            <w:tcW w:w="2159" w:type="dxa"/>
-            <w:tcBorders>
-              <w:top w:val="single" w:sz="4" w:space="0" w:color="000000"/>
-              <w:left w:val="single" w:sz="4" w:space="0" w:color="000000"/>
-              <w:bottom w:val="single" w:sz="4" w:space="0" w:color="000000"/>
-              <w:right w:val="single" w:sz="4" w:space="0" w:color="000000"/>
-            </w:tcBorders>
-            <w:vAlign w:val="center"/>
-          </w:tcPr>
-          <w:p>
-            <w:pPr>
-              <w:pStyle w:val="Normal"/>
-              <w:jc w:val="center"/>
-              <w:rPr>
-                <w:rFonts w:ascii="Arial Narrow" w:hAnsi="Arial Narrow"/>
-                <w:sz w:val="22"/>
-                <w:szCs w:val="22"/>
-              </w:rPr>
-            </w:pPr>
-            <w:r>
-              <w:rPr>
-                <w:rFonts w:ascii="Arial Narrow" w:hAnsi="Arial Narrow"/>
-                <w:sz w:val="22"/>
-                <w:szCs w:val="22"/>
-              </w:rPr>
-            </w:r>
-          </w:p>
-        </w:tc>
-        <w:tc>
-          <w:tcPr>
-            <w:tcW w:w="1642" w:type="dxa"/>
-            <w:tcBorders>
-              <w:top w:val="single" w:sz="4" w:space="0" w:color="000000"/>
-              <w:left w:val="single" w:sz="4" w:space="0" w:color="000000"/>
-              <w:bottom w:val="single" w:sz="4" w:space="0" w:color="000000"/>
-              <w:right w:val="single" w:sz="4" w:space="0" w:color="000000"/>
-            </w:tcBorders>
-            <w:vAlign w:val="center"/>
-          </w:tcPr>
-          <w:p>
-            <w:pPr>
-              <w:pStyle w:val="Normal"/>
-              <w:jc w:val="center"/>
-              <w:rPr>
-                <w:sz w:val="24"/>
-                <w:szCs w:val="24"/>
-              </w:rPr>
-            </w:pPr>
-            <w:r>
-              <w:rPr>
-                <w:sz w:val="24"/>
-                <w:szCs w:val="24"/>
-              </w:rPr>
-            </w:r>
-          </w:p>
-        </w:tc>
-      </w:tr>
-      <w:tr>
-        <w:trPr/>
-        <w:tc>
-          <w:tcPr>
-            <w:tcW w:w="5055" w:type="dxa"/>
-            <w:tcBorders>
-              <w:top w:val="single" w:sz="4" w:space="0" w:color="000000"/>
-              <w:left w:val="single" w:sz="4" w:space="0" w:color="000000"/>
-              <w:bottom w:val="single" w:sz="4" w:space="0" w:color="000000"/>
-              <w:right w:val="single" w:sz="4" w:space="0" w:color="000000"/>
-            </w:tcBorders>
-            <w:vAlign w:val="center"/>
-          </w:tcPr>
-          <w:p>
-            <w:pPr>
-              <w:pStyle w:val="Normal"/>
-              <w:jc w:val="both"/>
-              <w:rPr>
-                <w:rFonts w:ascii="Arial Narrow" w:hAnsi="Arial Narrow"/>
-                <w:sz w:val="24"/>
-                <w:szCs w:val="24"/>
-              </w:rPr>
-            </w:pPr>
-            <w:r>
-              <w:rPr>
-                <w:rFonts w:ascii="Arial Narrow" w:hAnsi="Arial Narrow"/>
-                <w:sz w:val="24"/>
-                <w:szCs w:val="24"/>
-              </w:rPr>
-            </w:r>
-          </w:p>
-        </w:tc>
-        <w:tc>
-          <w:tcPr>
-            <w:tcW w:w="2159" w:type="dxa"/>
-            <w:tcBorders>
-              <w:top w:val="single" w:sz="4" w:space="0" w:color="000000"/>
-              <w:left w:val="single" w:sz="4" w:space="0" w:color="000000"/>
-              <w:bottom w:val="single" w:sz="4" w:space="0" w:color="000000"/>
-              <w:right w:val="single" w:sz="4" w:space="0" w:color="000000"/>
-            </w:tcBorders>
-            <w:vAlign w:val="center"/>
-          </w:tcPr>
-          <w:p>
-            <w:pPr>
-              <w:pStyle w:val="Normal"/>
-              <w:jc w:val="center"/>
-              <w:rPr>
-                <w:rFonts w:ascii="Arial Narrow" w:hAnsi="Arial Narrow"/>
-                <w:sz w:val="22"/>
-                <w:szCs w:val="22"/>
-              </w:rPr>
-            </w:pPr>
-            <w:r>
-              <w:rPr>
-                <w:rFonts w:ascii="Arial Narrow" w:hAnsi="Arial Narrow"/>
-                <w:sz w:val="22"/>
-                <w:szCs w:val="22"/>
-              </w:rPr>
-            </w:r>
-          </w:p>
-        </w:tc>
-        <w:tc>
-          <w:tcPr>
-            <w:tcW w:w="1642" w:type="dxa"/>
-            <w:tcBorders>
-              <w:top w:val="single" w:sz="4" w:space="0" w:color="000000"/>
-              <w:left w:val="single" w:sz="4" w:space="0" w:color="000000"/>
-              <w:bottom w:val="single" w:sz="4" w:space="0" w:color="000000"/>
-              <w:right w:val="single" w:sz="4" w:space="0" w:color="000000"/>
-            </w:tcBorders>
-            <w:vAlign w:val="center"/>
-          </w:tcPr>
-          <w:p>
-            <w:pPr>
-              <w:pStyle w:val="Normal"/>
-              <w:jc w:val="center"/>
-              <w:rPr>
-                <w:sz w:val="24"/>
-                <w:szCs w:val="24"/>
-              </w:rPr>
-            </w:pPr>
-            <w:r>
-              <w:rPr>
-                <w:sz w:val="24"/>
-                <w:szCs w:val="24"/>
-              </w:rPr>
-            </w:r>
-          </w:p>
-        </w:tc>
-      </w:tr>
-      <w:tr>
-        <w:trPr/>
-        <w:tc>
-          <w:tcPr>
-            <w:tcW w:w="5055" w:type="dxa"/>
-            <w:tcBorders>
-              <w:top w:val="single" w:sz="4" w:space="0" w:color="000000"/>
-              <w:left w:val="single" w:sz="4" w:space="0" w:color="000000"/>
-              <w:bottom w:val="single" w:sz="4" w:space="0" w:color="000000"/>
-              <w:right w:val="single" w:sz="4" w:space="0" w:color="000000"/>
-            </w:tcBorders>
-            <w:vAlign w:val="center"/>
-          </w:tcPr>
-          <w:p>
-            <w:pPr>
-              <w:pStyle w:val="Normal"/>
-              <w:jc w:val="both"/>
-              <w:rPr>
-                <w:rFonts w:ascii="Arial Narrow" w:hAnsi="Arial Narrow"/>
-                <w:sz w:val="24"/>
-                <w:szCs w:val="24"/>
-              </w:rPr>
-            </w:pPr>
-            <w:r>
-              <w:rPr>
-                <w:rFonts w:ascii="Arial Narrow" w:hAnsi="Arial Narrow"/>
-                <w:sz w:val="24"/>
-                <w:szCs w:val="24"/>
-              </w:rPr>
-            </w:r>
-          </w:p>
-        </w:tc>
-        <w:tc>
-          <w:tcPr>
-            <w:tcW w:w="2159" w:type="dxa"/>
-            <w:tcBorders>
-              <w:top w:val="single" w:sz="4" w:space="0" w:color="000000"/>
-              <w:left w:val="single" w:sz="4" w:space="0" w:color="000000"/>
-              <w:bottom w:val="single" w:sz="4" w:space="0" w:color="000000"/>
-              <w:right w:val="single" w:sz="4" w:space="0" w:color="000000"/>
-            </w:tcBorders>
-            <w:vAlign w:val="center"/>
-          </w:tcPr>
-          <w:p>
-            <w:pPr>
-              <w:pStyle w:val="Normal"/>
-              <w:jc w:val="center"/>
-              <w:rPr>
-                <w:rFonts w:ascii="Arial Narrow" w:hAnsi="Arial Narrow"/>
-                <w:sz w:val="22"/>
-                <w:szCs w:val="22"/>
-              </w:rPr>
-            </w:pPr>
-            <w:r>
-              <w:rPr>
-                <w:rFonts w:ascii="Arial Narrow" w:hAnsi="Arial Narrow"/>
-                <w:sz w:val="22"/>
-                <w:szCs w:val="22"/>
-              </w:rPr>
-            </w:r>
-          </w:p>
-        </w:tc>
-        <w:tc>
-          <w:tcPr>
-            <w:tcW w:w="1642" w:type="dxa"/>
-            <w:tcBorders>
-              <w:top w:val="single" w:sz="4" w:space="0" w:color="000000"/>
-              <w:left w:val="single" w:sz="4" w:space="0" w:color="000000"/>
-              <w:bottom w:val="single" w:sz="4" w:space="0" w:color="000000"/>
-              <w:right w:val="single" w:sz="4" w:space="0" w:color="000000"/>
-            </w:tcBorders>
-            <w:vAlign w:val="center"/>
-          </w:tcPr>
-          <w:p>
-            <w:pPr>
-              <w:pStyle w:val="Normal"/>
-              <w:jc w:val="center"/>
-              <w:rPr>
-                <w:sz w:val="24"/>
-                <w:szCs w:val="24"/>
-              </w:rPr>
-            </w:pPr>
-            <w:r>
-              <w:rPr>
-                <w:sz w:val="24"/>
-                <w:szCs w:val="24"/>
-              </w:rPr>
-            </w:r>
-          </w:p>
-        </w:tc>
-      </w:tr>
-      <w:tr>
-        <w:trPr/>
-        <w:tc>
-          <w:tcPr>
-            <w:tcW w:w="5055" w:type="dxa"/>
-            <w:tcBorders>
-              <w:top w:val="single" w:sz="4" w:space="0" w:color="000000"/>
-              <w:left w:val="single" w:sz="4" w:space="0" w:color="000000"/>
-              <w:bottom w:val="single" w:sz="4" w:space="0" w:color="000000"/>
-              <w:right w:val="single" w:sz="4" w:space="0" w:color="000000"/>
-            </w:tcBorders>
-            <w:vAlign w:val="center"/>
-          </w:tcPr>
-          <w:p>
-            <w:pPr>
-              <w:pStyle w:val="Normal"/>
-              <w:jc w:val="both"/>
-              <w:rPr>
-                <w:rFonts w:ascii="Arial Narrow" w:hAnsi="Arial Narrow"/>
-                <w:sz w:val="24"/>
-                <w:szCs w:val="24"/>
-              </w:rPr>
-            </w:pPr>
-            <w:r>
-              <w:rPr>
-                <w:rFonts w:ascii="Arial Narrow" w:hAnsi="Arial Narrow"/>
-                <w:sz w:val="24"/>
-                <w:szCs w:val="24"/>
-              </w:rPr>
-            </w:r>
-          </w:p>
-        </w:tc>
-        <w:tc>
-          <w:tcPr>
-            <w:tcW w:w="2159" w:type="dxa"/>
+            <w:tcW w:w="2522" w:type="dxa"/>
             <w:tcBorders>
               <w:top w:val="single" w:sz="4" w:space="0" w:color="000000"/>
               <w:left w:val="single" w:sz="4" w:space="0" w:color="000000"/>
@@ -2061,7 +1189,7 @@
         </w:rPr>
         <w:t xml:space="preserve">WHEREAS, upon post-qualification or careful examination, validation and verification of all the eligibility, technical and financial requirements submitted by the Bidders with the Lowest Calculated Bid, </w:t>
       </w:r>
-      <w:bookmarkStart w:id="5" w:name="bmCompanyName5"/>
+      <w:bookmarkStart w:id="3" w:name="bmCompanyName5"/>
       <w:r>
         <w:rPr>
           <w:b/>
@@ -2070,7 +1198,7 @@
         </w:rPr>
         <w:t>{{winning_bidder_upper}}</w:t>
       </w:r>
-      <w:bookmarkEnd w:id="5"/>
+      <w:bookmarkEnd w:id="3"/>
       <w:r>
         <w:rPr>
           <w:sz w:val="24"/>
@@ -2166,7 +1294,7 @@
         </w:rPr>
         <w:t xml:space="preserve">To declare </w:t>
       </w:r>
-      <w:bookmarkStart w:id="6" w:name="bmCompanyName6"/>
+      <w:bookmarkStart w:id="4" w:name="bmCompanyName6"/>
       <w:r>
         <w:rPr>
           <w:b/>
@@ -2175,7 +1303,7 @@
         </w:rPr>
         <w:t>{{winning_bidder_upper}}</w:t>
       </w:r>
-      <w:bookmarkEnd w:id="6"/>
+      <w:bookmarkEnd w:id="4"/>
       <w:r>
         <w:rPr>
           <w:sz w:val="24"/>
@@ -3875,6 +3003,29 @@
       <w:lang w:val="en-GB" w:eastAsia="en-GB"/>
     </w:rPr>
   </w:style>
+  <w:style w:type="paragraph" w:styleId="TableContents">
+    <w:name w:val="Table Contents"/>
+    <w:basedOn w:val="Normal"/>
+    <w:qFormat/>
+    <w:pPr>
+      <w:widowControl w:val="false"/>
+      <w:suppressLineNumbers/>
+    </w:pPr>
+    <w:rPr/>
+  </w:style>
+  <w:style w:type="paragraph" w:styleId="TableHeading">
+    <w:name w:val="Table Heading"/>
+    <w:basedOn w:val="TableContents"/>
+    <w:qFormat/>
+    <w:pPr>
+      <w:suppressLineNumbers/>
+      <w:jc w:val="center"/>
+    </w:pPr>
+    <w:rPr>
+      <w:b/>
+      <w:bCs/>
+    </w:rPr>
+  </w:style>
   <w:style w:type="numbering" w:styleId="NoList" w:default="1">
     <w:name w:val="No List"/>
     <w:semiHidden/>

</xml_diff>

<commit_message>
multi table supported editable, input value persistence on page reload, default value from project model not overriden
</commit_message>
<xml_diff>
--- a/public/docs/BAC Resolution Declaring LCRB.docx
+++ b/public/docs/BAC Resolution Declaring LCRB.docx
@@ -823,7 +823,7 @@
                 <w:sz w:val="24"/>
                 <w:szCs w:val="24"/>
               </w:rPr>
-              <w:t>{row_bidder_upper}}</w:t>
+              <w:t>{row_a_bidder_upper}}</w:t>
             </w:r>
           </w:p>
         </w:tc>
@@ -861,7 +861,7 @@
                 <w:sz w:val="24"/>
                 <w:szCs w:val="22"/>
               </w:rPr>
-              <w:t>{row_amount_read}}</w:t>
+              <w:t>{row_a_amount}}</w:t>
             </w:r>
           </w:p>
         </w:tc>
@@ -892,7 +892,7 @@
                 <w:sz w:val="24"/>
                 <w:szCs w:val="24"/>
               </w:rPr>
-              <w:t>{{row_variance}}</w:t>
+              <w:t>{{row_a_variance}}</w:t>
             </w:r>
           </w:p>
         </w:tc>
@@ -961,15 +961,15 @@
         <w:tblLook w:noHBand="0" w:noVBand="0" w:firstColumn="0" w:lastRow="0" w:lastColumn="0" w:firstRow="0" w:val="0000"/>
       </w:tblPr>
       <w:tblGrid>
-        <w:gridCol w:w="4692"/>
-        <w:gridCol w:w="2522"/>
+        <w:gridCol w:w="5130"/>
+        <w:gridCol w:w="2084"/>
         <w:gridCol w:w="1642"/>
       </w:tblGrid>
       <w:tr>
         <w:trPr/>
         <w:tc>
           <w:tcPr>
-            <w:tcW w:w="4692" w:type="dxa"/>
+            <w:tcW w:w="5130" w:type="dxa"/>
             <w:tcBorders>
               <w:top w:val="single" w:sz="4" w:space="0" w:color="000000"/>
               <w:left w:val="single" w:sz="4" w:space="0" w:color="000000"/>
@@ -999,7 +999,7 @@
         </w:tc>
         <w:tc>
           <w:tcPr>
-            <w:tcW w:w="2522" w:type="dxa"/>
+            <w:tcW w:w="2084" w:type="dxa"/>
             <w:tcBorders>
               <w:top w:val="single" w:sz="4" w:space="0" w:color="000000"/>
               <w:left w:val="single" w:sz="4" w:space="0" w:color="000000"/>
@@ -1064,7 +1064,7 @@
         <w:trPr/>
         <w:tc>
           <w:tcPr>
-            <w:tcW w:w="4692" w:type="dxa"/>
+            <w:tcW w:w="5130" w:type="dxa"/>
             <w:tcBorders>
               <w:top w:val="single" w:sz="4" w:space="0" w:color="000000"/>
               <w:left w:val="single" w:sz="4" w:space="0" w:color="000000"/>
@@ -1083,23 +1083,23 @@
               </w:tabs>
               <w:jc w:val="both"/>
               <w:rPr>
-                <w:rFonts w:ascii="Arial Narrow" w:hAnsi="Arial Narrow"/>
-                <w:sz w:val="24"/>
-                <w:szCs w:val="24"/>
+                <w:rFonts w:ascii="Times New Roman" w:hAnsi="Times New Roman"/>
               </w:rPr>
             </w:pPr>
             <w:r>
               <w:rPr>
-                <w:rFonts w:ascii="Arial Narrow" w:hAnsi="Arial Narrow"/>
+                <w:b/>
+                <w:bCs/>
                 <w:sz w:val="24"/>
                 <w:szCs w:val="24"/>
               </w:rPr>
+              <w:t>{{row_b_bidder_upper}}</w:t>
             </w:r>
           </w:p>
         </w:tc>
         <w:tc>
           <w:tcPr>
-            <w:tcW w:w="2522" w:type="dxa"/>
+            <w:tcW w:w="2084" w:type="dxa"/>
             <w:tcBorders>
               <w:top w:val="single" w:sz="4" w:space="0" w:color="000000"/>
               <w:left w:val="single" w:sz="4" w:space="0" w:color="000000"/>
@@ -1113,17 +1113,15 @@
               <w:pStyle w:val="Normal"/>
               <w:jc w:val="center"/>
               <w:rPr>
-                <w:rFonts w:ascii="Arial Narrow" w:hAnsi="Arial Narrow"/>
-                <w:sz w:val="22"/>
-                <w:szCs w:val="22"/>
+                <w:rFonts w:ascii="Times New Roman" w:hAnsi="Times New Roman"/>
               </w:rPr>
             </w:pPr>
             <w:r>
               <w:rPr>
-                <w:rFonts w:ascii="Arial Narrow" w:hAnsi="Arial Narrow"/>
                 <w:sz w:val="22"/>
                 <w:szCs w:val="22"/>
               </w:rPr>
+              <w:t>{{row_b_amount}}</w:t>
             </w:r>
           </w:p>
         </w:tc>
@@ -1152,6 +1150,7 @@
                 <w:sz w:val="24"/>
                 <w:szCs w:val="24"/>
               </w:rPr>
+              <w:t>{{row_b_variance}}</w:t>
             </w:r>
           </w:p>
         </w:tc>
@@ -1309,7 +1308,7 @@
           <w:sz w:val="24"/>
           <w:szCs w:val="24"/>
         </w:rPr>
-        <w:t xml:space="preserve"> as the Bidder with the Lowest Calculated Responsive Bid for the </w:t>
+        <w:t xml:space="preserve"> as the Bidder with the Lowest Calculated Responsive Bid for the  </w:t>
       </w:r>
       <w:r>
         <w:rPr>

</xml_diff>

<commit_message>
added validation to prevent empty fields
</commit_message>
<xml_diff>
--- a/public/docs/BAC Resolution Declaring LCRB.docx
+++ b/public/docs/BAC Resolution Declaring LCRB.docx
@@ -1113,13 +1113,14 @@
               <w:pStyle w:val="Normal"/>
               <w:jc w:val="center"/>
               <w:rPr>
-                <w:rFonts w:ascii="Times New Roman" w:hAnsi="Times New Roman"/>
+                <w:sz w:val="24"/>
+                <w:szCs w:val="24"/>
               </w:rPr>
             </w:pPr>
             <w:r>
               <w:rPr>
-                <w:sz w:val="22"/>
-                <w:szCs w:val="22"/>
+                <w:sz w:val="24"/>
+                <w:szCs w:val="24"/>
               </w:rPr>
               <w:t>{{row_b_amount}}</w:t>
             </w:r>
@@ -1308,7 +1309,7 @@
           <w:sz w:val="24"/>
           <w:szCs w:val="24"/>
         </w:rPr>
-        <w:t xml:space="preserve"> as the Bidder with the Lowest Calculated Responsive Bid for the  </w:t>
+        <w:t xml:space="preserve"> as the Bidder with the Lowest Calculated Responsive Bid for the </w:t>
       </w:r>
       <w:r>
         <w:rPr>

</xml_diff>

<commit_message>
refac table 1 to have pre filled values
</commit_message>
<xml_diff>
--- a/public/docs/BAC Resolution Declaring LCRB.docx
+++ b/public/docs/BAC Resolution Declaring LCRB.docx
@@ -780,7 +780,9 @@
         </w:tc>
       </w:tr>
       <w:tr>
-        <w:trPr/>
+        <w:trPr>
+          <w:trHeight w:val="443" w:hRule="atLeast"/>
+        </w:trPr>
         <w:tc>
           <w:tcPr>
             <w:tcW w:w="5145" w:type="dxa"/>
@@ -802,12 +804,11 @@
               </w:tabs>
               <w:jc w:val="both"/>
               <w:rPr>
-                <w:rFonts w:ascii="Arial Narrow" w:hAnsi="Arial Narrow"/>
                 <w:sz w:val="24"/>
                 <w:szCs w:val="24"/>
               </w:rPr>
             </w:pPr>
-            <w:bookmarkStart w:id="0" w:name="bmCompanyName3"/>
+            <w:bookmarkStart w:id="0" w:name="bmCompanyName3_Copy_1"/>
             <w:r>
               <w:rPr>
                 <w:b/>
@@ -844,14 +845,14 @@
               <w:jc w:val="center"/>
               <w:rPr>
                 <w:sz w:val="24"/>
-                <w:szCs w:val="22"/>
+                <w:szCs w:val="24"/>
               </w:rPr>
             </w:pPr>
-            <w:bookmarkStart w:id="1" w:name="bmAmountFigures"/>
+            <w:bookmarkStart w:id="1" w:name="bmAmountFigures_Copy_1"/>
             <w:r>
               <w:rPr>
                 <w:sz w:val="24"/>
-                <w:szCs w:val="22"/>
+                <w:szCs w:val="24"/>
               </w:rPr>
               <w:t>{</w:t>
             </w:r>
@@ -859,7 +860,7 @@
             <w:r>
               <w:rPr>
                 <w:sz w:val="24"/>
-                <w:szCs w:val="22"/>
+                <w:szCs w:val="24"/>
               </w:rPr>
               <w:t>{row_a_amount}}</w:t>
             </w:r>
@@ -885,14 +886,12 @@
                 <w:szCs w:val="24"/>
               </w:rPr>
             </w:pPr>
-            <w:bookmarkStart w:id="2" w:name="_Hlk532640973"/>
-            <w:bookmarkEnd w:id="2"/>
             <w:r>
               <w:rPr>
                 <w:sz w:val="24"/>
                 <w:szCs w:val="24"/>
               </w:rPr>
-              <w:t>{{row_a_variance}}</w:t>
+              <w:t>{{row_a_variance}}%</w:t>
             </w:r>
           </w:p>
         </w:tc>
@@ -1198,7 +1197,7 @@
         </w:rPr>
         <w:t xml:space="preserve">WHEREAS, upon post-qualification or careful examination, validation and verification of all the eligibility, technical and financial requirements submitted by the Bidders with the Lowest Calculated Bid, </w:t>
       </w:r>
-      <w:bookmarkStart w:id="3" w:name="bmCompanyName5"/>
+      <w:bookmarkStart w:id="2" w:name="bmCompanyName5"/>
       <w:r>
         <w:rPr>
           <w:b/>
@@ -1207,7 +1206,7 @@
         </w:rPr>
         <w:t>{{winning_bidder_upper}}</w:t>
       </w:r>
-      <w:bookmarkEnd w:id="3"/>
+      <w:bookmarkEnd w:id="2"/>
       <w:r>
         <w:rPr>
           <w:sz w:val="24"/>
@@ -1303,7 +1302,7 @@
         </w:rPr>
         <w:t xml:space="preserve">To declare </w:t>
       </w:r>
-      <w:bookmarkStart w:id="4" w:name="bmCompanyName6"/>
+      <w:bookmarkStart w:id="3" w:name="bmCompanyName6"/>
       <w:r>
         <w:rPr>
           <w:b/>
@@ -1312,7 +1311,7 @@
         </w:rPr>
         <w:t>{{winning_bidder_upper}}</w:t>
       </w:r>
-      <w:bookmarkEnd w:id="4"/>
+      <w:bookmarkEnd w:id="3"/>
       <w:r>
         <w:rPr>
           <w:sz w:val="24"/>

</xml_diff>

<commit_message>
res num field strict input values
</commit_message>
<xml_diff>
--- a/public/docs/BAC Resolution Declaring LCRB.docx
+++ b/public/docs/BAC Resolution Declaring LCRB.docx
@@ -501,7 +501,7 @@
           <w:sz w:val="24"/>
           <w:szCs w:val="24"/>
         </w:rPr>
-        <w:t>WHEREAS, in response to the said advertisements and publication, there were {{total_interested_bidders_lower}} interested bidders who submitted letter of intent and {{number_of_responsive_bidders}} of these bidders purchased bidding documents and</w:t>
+        <w:t>WHEREAS, in response to the said advertisements and publication, there were {{total_interested_bidders_lower}} interested bidders who submitted letter of intent and {{responsive_bidders}} of these bidders purchased bidding documents and</w:t>
       </w:r>
       <w:r>
         <w:rPr>
@@ -525,7 +525,7 @@
           <w:sz w:val="24"/>
           <w:szCs w:val="24"/>
         </w:rPr>
-        <w:t>{{bidders_upper}}</w:t>
+        <w:t>{{list_of_bidders_upper}}</w:t>
       </w:r>
     </w:p>
     <w:p>

</xml_diff>

<commit_message>
dynamic input for table rows, refac input field types in doc1
</commit_message>
<xml_diff>
--- a/public/docs/BAC Resolution Declaring LCRB.docx
+++ b/public/docs/BAC Resolution Declaring LCRB.docx
@@ -307,16 +307,12 @@
         <w:pStyle w:val="BodyText"/>
         <w:jc w:val="center"/>
         <w:rPr>
-          <w:rFonts w:ascii="Times New Roman" w:hAnsi="Times New Roman"/>
-          <w:b/>
-          <w:sz w:val="24"/>
-          <w:szCs w:val="24"/>
-        </w:rPr>
-      </w:pPr>
-      <w:r>
-        <w:rPr>
-          <w:rFonts w:ascii="Times New Roman" w:hAnsi="Times New Roman"/>
-          <w:b/>
+          <w:sz w:val="24"/>
+          <w:szCs w:val="24"/>
+        </w:rPr>
+      </w:pPr>
+      <w:r>
+        <w:rPr>
           <w:sz w:val="24"/>
           <w:szCs w:val="24"/>
         </w:rPr>
@@ -328,155 +324,142 @@
         <w:ind w:firstLine="720"/>
         <w:jc w:val="both"/>
         <w:rPr>
-          <w:b/>
-          <w:color w:val="000000"/>
-          <w:sz w:val="24"/>
-          <w:szCs w:val="24"/>
-        </w:rPr>
-      </w:pPr>
-      <w:r>
-        <w:rPr>
-          <w:sz w:val="24"/>
-          <w:szCs w:val="24"/>
-        </w:rPr>
-        <w:t xml:space="preserve">WHEREAS, the </w:t>
-      </w:r>
-      <w:r>
-        <w:rPr>
-          <w:b/>
-          <w:sz w:val="24"/>
-          <w:szCs w:val="24"/>
-        </w:rPr>
-        <w:t>Local Government Unit of Casiguran</w:t>
-      </w:r>
-      <w:r>
-        <w:rPr>
-          <w:sz w:val="24"/>
-          <w:szCs w:val="24"/>
-        </w:rPr>
-        <w:t xml:space="preserve"> posted and advertised the Invitation to Bid for</w:t>
-      </w:r>
-      <w:r>
-        <w:rPr>
           <w:b w:val="false"/>
           <w:bCs w:val="false"/>
-          <w:sz w:val="24"/>
-          <w:szCs w:val="24"/>
-        </w:rPr>
-        <w:t xml:space="preserve"> </w:t>
-      </w:r>
-      <w:r>
-        <w:rPr>
-          <w:b/>
-          <w:bCs/>
-          <w:sz w:val="24"/>
-          <w:szCs w:val="24"/>
-          <w:lang w:val="en-PH" w:eastAsia="en-PH"/>
-        </w:rPr>
-        <w:t>{{project_title_upper}}</w:t>
-      </w:r>
+          <w:color w:val="000000"/>
+          <w:sz w:val="24"/>
+          <w:szCs w:val="24"/>
+        </w:rPr>
+      </w:pPr>
       <w:r>
         <w:rPr>
           <w:b w:val="false"/>
           <w:bCs w:val="false"/>
-          <w:sz w:val="32"/>
-          <w:szCs w:val="24"/>
-          <w:lang w:val="en-PH" w:eastAsia="en-PH"/>
-        </w:rPr>
-        <w:t xml:space="preserve"> </w:t>
-      </w:r>
-      <w:r>
-        <w:rPr>
-          <w:sz w:val="24"/>
-          <w:szCs w:val="24"/>
-        </w:rPr>
-        <w:t xml:space="preserve">at the PhilGEPS’s (Philippine Government Electronic Procurement System) website on </w:t>
-      </w:r>
-      <w:r>
-        <w:rPr>
-          <w:b/>
-          <w:sz w:val="24"/>
-          <w:szCs w:val="24"/>
-        </w:rPr>
-        <w:t>{{philGEPS_posting_date}}</w:t>
-      </w:r>
-      <w:r>
-        <w:rPr>
-          <w:sz w:val="24"/>
-          <w:szCs w:val="24"/>
-        </w:rPr>
-        <w:t xml:space="preserve"> and posted in a conspicuous place from </w:t>
-      </w:r>
-      <w:r>
-        <w:rPr>
-          <w:b/>
-          <w:sz w:val="24"/>
-          <w:szCs w:val="24"/>
-        </w:rPr>
-        <w:t>{{conspicuous_place_posting_date}}</w:t>
-      </w:r>
-      <w:r>
-        <w:rPr>
-          <w:sz w:val="24"/>
-          <w:szCs w:val="24"/>
-        </w:rPr>
-        <w:t xml:space="preserve">. </w:t>
-      </w:r>
-      <w:r>
-        <w:rPr>
+          <w:color w:val="000000"/>
+          <w:sz w:val="24"/>
+          <w:szCs w:val="24"/>
+        </w:rPr>
+        <w:t xml:space="preserve">WHEREAS, the </w:t>
+      </w:r>
+      <w:r>
+        <w:rPr>
+          <w:b/>
+          <w:bCs/>
+          <w:color w:val="000000"/>
+          <w:sz w:val="24"/>
+          <w:szCs w:val="24"/>
+        </w:rPr>
+        <w:t xml:space="preserve">Local Government Unit of Casiguran </w:t>
+      </w:r>
+      <w:r>
+        <w:rPr>
+          <w:b w:val="false"/>
+          <w:bCs w:val="false"/>
+          <w:color w:val="000000"/>
+          <w:sz w:val="24"/>
+          <w:szCs w:val="24"/>
+        </w:rPr>
+        <w:t xml:space="preserve">posted and advertised the Invitation to Bid for </w:t>
+      </w:r>
+      <w:r>
+        <w:rPr>
+          <w:b/>
+          <w:bCs/>
+          <w:color w:val="000000"/>
+          <w:sz w:val="24"/>
+          <w:szCs w:val="24"/>
+        </w:rPr>
+        <w:t xml:space="preserve">{{project_title_upper}} </w:t>
+      </w:r>
+      <w:r>
+        <w:rPr>
+          <w:b w:val="false"/>
+          <w:bCs w:val="false"/>
+          <w:color w:val="000000"/>
+          <w:sz w:val="24"/>
+          <w:szCs w:val="24"/>
+        </w:rPr>
+        <w:t xml:space="preserve">at the PhilGEPS’s (Philippines Government Electronic Procurement System) website on </w:t>
+      </w:r>
+      <w:r>
+        <w:rPr>
+          <w:b/>
+          <w:bCs/>
+          <w:color w:val="000000"/>
+          <w:sz w:val="24"/>
+          <w:szCs w:val="24"/>
+        </w:rPr>
+        <w:t xml:space="preserve">{{philGEPS_posting_date}} </w:t>
+      </w:r>
+      <w:r>
+        <w:rPr>
+          <w:b w:val="false"/>
+          <w:bCs w:val="false"/>
+          <w:color w:val="000000"/>
+          <w:sz w:val="24"/>
+          <w:szCs w:val="24"/>
+        </w:rPr>
+        <w:t xml:space="preserve">and posted in a conspicuous place from </w:t>
+      </w:r>
+      <w:r>
+        <w:rPr>
+          <w:b/>
+          <w:bCs/>
+          <w:color w:val="000000"/>
+          <w:sz w:val="24"/>
+          <w:szCs w:val="24"/>
+        </w:rPr>
+        <w:t>{{conspicuous_place_posting_start_date}} – {{conspicuous_place_posting_end_date}}</w:t>
+      </w:r>
+      <w:r>
+        <w:rPr>
+          <w:b w:val="false"/>
+          <w:bCs w:val="false"/>
+          <w:color w:val="000000"/>
+          <w:sz w:val="24"/>
+          <w:szCs w:val="24"/>
+        </w:rPr>
+        <w:t xml:space="preserve">. The Approved Budget for the Contract is </w:t>
+      </w:r>
+      <w:r>
+        <w:rPr>
+          <w:b/>
+          <w:bCs/>
+          <w:color w:val="000000"/>
+          <w:sz w:val="24"/>
+          <w:szCs w:val="24"/>
+        </w:rPr>
+        <w:t>Php {{approved_budget_formatAmount}}</w:t>
+      </w:r>
+      <w:r>
+        <w:rPr>
+          <w:b w:val="false"/>
+          <w:bCs w:val="false"/>
+          <w:color w:val="000000"/>
+          <w:sz w:val="24"/>
+          <w:szCs w:val="24"/>
+        </w:rPr>
+        <w:t>.</w:t>
+      </w:r>
+    </w:p>
+    <w:p>
+      <w:pPr>
+        <w:pStyle w:val="Normal"/>
+        <w:jc w:val="both"/>
+        <w:rPr>
+          <w:b/>
           <w:bCs/>
           <w:sz w:val="22"/>
           <w:szCs w:val="22"/>
         </w:rPr>
-        <w:t xml:space="preserve">The Approved Budget for the Contract is </w:t>
-      </w:r>
-      <w:r>
-        <w:rPr>
-          <w:b/>
-          <w:color w:val="000000"/>
-          <w:sz w:val="24"/>
-          <w:szCs w:val="24"/>
-        </w:rPr>
-        <w:t xml:space="preserve">Php </w:t>
-      </w:r>
-      <w:r>
-        <w:rPr>
-          <w:b/>
-          <w:bCs/>
-          <w:color w:val="000000"/>
-          <w:sz w:val="24"/>
-          <w:szCs w:val="24"/>
-        </w:rPr>
-        <w:t>{{approved_budget}}</w:t>
-      </w:r>
-      <w:r>
-        <w:rPr>
-          <w:b/>
-          <w:color w:val="000000"/>
-          <w:sz w:val="24"/>
-          <w:szCs w:val="24"/>
-        </w:rPr>
-        <w:t xml:space="preserve">.  </w:t>
-      </w:r>
-    </w:p>
-    <w:p>
-      <w:pPr>
-        <w:pStyle w:val="Normal"/>
-        <w:jc w:val="both"/>
+      </w:pPr>
+      <w:r>
         <w:rPr>
           <w:b/>
           <w:bCs/>
           <w:sz w:val="22"/>
           <w:szCs w:val="22"/>
         </w:rPr>
-      </w:pPr>
-      <w:r>
-        <w:rPr>
-          <w:b/>
-          <w:bCs/>
-          <w:sz w:val="22"/>
-          <w:szCs w:val="22"/>
-        </w:rPr>
       </w:r>
     </w:p>
     <w:p>
@@ -501,7 +484,7 @@
           <w:sz w:val="24"/>
           <w:szCs w:val="24"/>
         </w:rPr>
-        <w:t>WHEREAS, in response to the said advertisements and publication, there were {{total_interested_bidders_lower}} interested bidders who submitted letter of intent and {{responsive_bidders}} of these bidders purchased bidding documents and</w:t>
+        <w:t>WHEREAS, in response to the said advertisements and publication, there were {{total_interested_bidders_wordNum}} interested bidders who submitted letter of intent and {{responsive_bidders_wordNum}} of these bidders purchased bidding documents and</w:t>
       </w:r>
       <w:r>
         <w:rPr>
@@ -560,7 +543,7 @@
           <w:sz w:val="24"/>
           <w:szCs w:val="24"/>
         </w:rPr>
-        <w:t>WHEREAS, upon evaluation of technical component, the BAC determined that the six bidders</w:t>
+        <w:t>WHEREAS, upon evaluation of technical component, the BAC determined that the {{eligible_bidders_numWord}} bidders</w:t>
       </w:r>
       <w:r>
         <w:rPr>
@@ -862,7 +845,7 @@
                 <w:sz w:val="24"/>
                 <w:szCs w:val="24"/>
               </w:rPr>
-              <w:t>{row_a_amount}}</w:t>
+              <w:t>{row_a_amount_formatAmount}}</w:t>
             </w:r>
           </w:p>
         </w:tc>
@@ -1130,7 +1113,7 @@
                 <w:sz w:val="24"/>
                 <w:szCs w:val="24"/>
               </w:rPr>
-              <w:t>{{row_b_amount}}</w:t>
+              <w:t>{{row_b_amount_formatAmount}}</w:t>
             </w:r>
           </w:p>
         </w:tc>
@@ -1159,7 +1142,7 @@
                 <w:sz w:val="24"/>
                 <w:szCs w:val="24"/>
               </w:rPr>
-              <w:t>{{row_b_variance}}</w:t>
+              <w:t>{{row_b_variance}}%</w:t>
             </w:r>
           </w:p>
         </w:tc>
@@ -1425,10 +1408,7 @@
       <w:pPr>
         <w:pStyle w:val="Normal"/>
         <w:jc w:val="both"/>
-        <w:rPr>
-          <w:sz w:val="24"/>
-          <w:szCs w:val="24"/>
-        </w:rPr>
+        <w:rPr/>
       </w:pPr>
       <w:r>
         <w:rPr>
@@ -1439,11 +1419,36 @@
       </w:r>
       <w:r>
         <w:rPr>
-          <w:b/>
-          <w:sz w:val="24"/>
-          <w:szCs w:val="24"/>
-        </w:rPr>
-        <w:t>___________________.</w:t>
+          <w:sz w:val="24"/>
+          <w:szCs w:val="24"/>
+          <w:u w:val="single"/>
+        </w:rPr>
+        <w:t>_________</w:t>
+      </w:r>
+      <w:r>
+        <w:rPr>
+          <w:b/>
+          <w:bCs/>
+          <w:sz w:val="24"/>
+          <w:szCs w:val="24"/>
+          <w:u w:val="single"/>
+        </w:rPr>
+        <w:t>{{resolution_date}}</w:t>
+      </w:r>
+      <w:r>
+        <w:rPr>
+          <w:sz w:val="24"/>
+          <w:szCs w:val="24"/>
+          <w:u w:val="single"/>
+        </w:rPr>
+        <w:t>________</w:t>
+      </w:r>
+      <w:r>
+        <w:rPr>
+          <w:sz w:val="24"/>
+          <w:szCs w:val="24"/>
+        </w:rPr>
+        <w:t>.</w:t>
       </w:r>
     </w:p>
     <w:p>
@@ -2061,7 +2066,32 @@
           <w:sz w:val="24"/>
           <w:szCs w:val="24"/>
         </w:rPr>
-        <w:t>Date approved: _____________________</w:t>
+        <w:t>Date approved:</w:t>
+      </w:r>
+      <w:r>
+        <w:rPr>
+          <w:sz w:val="24"/>
+          <w:szCs w:val="24"/>
+          <w:u w:val="none"/>
+        </w:rPr>
+        <w:t xml:space="preserve"> </w:t>
+      </w:r>
+      <w:r>
+        <w:rPr>
+          <w:sz w:val="24"/>
+          <w:szCs w:val="24"/>
+          <w:u w:val="single"/>
+        </w:rPr>
+        <w:t xml:space="preserve">       {{approved_date}}          </w:t>
+      </w:r>
+      <w:r>
+        <w:rPr>
+          <w:color w:val="FFFFFF"/>
+          <w:sz w:val="24"/>
+          <w:szCs w:val="24"/>
+          <w:u w:val="single"/>
+        </w:rPr>
+        <w:t>}</w:t>
       </w:r>
     </w:p>
     <w:p>

</xml_diff>

<commit_message>
dynamic input fields for doc2
</commit_message>
<xml_diff>
--- a/public/docs/BAC Resolution Declaring LCRB.docx
+++ b/public/docs/BAC Resolution Declaring LCRB.docx
@@ -484,7 +484,35 @@
           <w:sz w:val="24"/>
           <w:szCs w:val="24"/>
         </w:rPr>
-        <w:t>WHEREAS, in response to the said advertisements and publication, there were {{total_interested_bidders_wordNum}} interested bidders who submitted letter of intent and {{responsive_bidders_wordNum}} of these bidders purchased bidding documents and</w:t>
+        <w:t xml:space="preserve">WHEREAS, in response to the said advertisements and publication, there were </w:t>
+      </w:r>
+      <w:r>
+        <w:rPr>
+          <w:sz w:val="24"/>
+          <w:szCs w:val="24"/>
+        </w:rPr>
+        <w:t>{{total_interested_bidders_wordNumLower}}</w:t>
+      </w:r>
+      <w:r>
+        <w:rPr>
+          <w:sz w:val="24"/>
+          <w:szCs w:val="24"/>
+        </w:rPr>
+        <w:t xml:space="preserve"> interested bidders who submitted letter of intent and </w:t>
+      </w:r>
+      <w:r>
+        <w:rPr>
+          <w:sz w:val="24"/>
+          <w:szCs w:val="24"/>
+        </w:rPr>
+        <w:t>{{responsive_bidders_wordNumLower}}</w:t>
+      </w:r>
+      <w:r>
+        <w:rPr>
+          <w:sz w:val="24"/>
+          <w:szCs w:val="24"/>
+        </w:rPr>
+        <w:t xml:space="preserve"> of these bidders purchased bidding documents and</w:t>
       </w:r>
       <w:r>
         <w:rPr>

</xml_diff>